<commit_message>
feat(thesis-ch2): add H1b FIP hypothesis to thesis Chapter 2 and theoretical framework
Formally states H1b (Forced Internationalization Penalty boundary condition)
in both the CTU 5-chapter format (chuong_2) and the draft theoretical
framework file (02_theoretical_framework_vi.md):
- §2.5.2b: 3-paragraph FIP theory grounding (3 violated structural prerequisites,
  mechanism explaining monotone-negative I-P at SIDS, formal H1b statement)
- §H1b section in 02_theoretical_framework_vi.md with citations
- Hypothesis mapping table updated with H1b testing approach (M1 linear, LM
  U-test NS, exporters-only robustness, Pacific SIDS P8)
Rebuilds dist/luan_an/02_theoretical_framework_vi.docx and
dist/luan_an_ctu/chuong_2_tong_quan_tai_lieu_vi.docx via pandoc.

https://claude.ai/code/session_01GMFmEtt6FYiJ4MKzBNCLqb
</commit_message>
<xml_diff>
--- a/dist/luan_an/02_theoretical_framework_vi.docx
+++ b/dist/luan_an/02_theoretical_framework_vi.docx
@@ -2,7 +2,7 @@
 <file path=word/document.xml><?xml version="1.0" encoding="utf-8"?>
 <w:document xmlns:w="http://schemas.openxmlformats.org/wordprocessingml/2006/main" xmlns:m="http://schemas.openxmlformats.org/officeDocument/2006/math" xmlns:r="http://schemas.openxmlformats.org/officeDocument/2006/relationships" xmlns:o="urn:schemas-microsoft-com:office:office" xmlns:v="urn:schemas-microsoft-com:vml" xmlns:w10="urn:schemas-microsoft-com:office:word" xmlns:a="http://schemas.openxmlformats.org/drawingml/2006/main" xmlns:pic="http://schemas.openxmlformats.org/drawingml/2006/picture" xmlns:wp="http://schemas.openxmlformats.org/drawingml/2006/wordprocessingDrawing">
   <w:body>
-    <w:bookmarkStart w:id="37" w:name="khung-lý-thuyết-và-hệ-giả-thuyết"/>
+    <w:bookmarkStart w:id="38" w:name="khung-lý-thuyết-và-hệ-giả-thuyết"/>
     <w:p>
       <w:pPr>
         <w:pStyle w:val="Heading1"/>
@@ -165,7 +165,23 @@
         <w:pStyle w:val="BodyText"/>
       </w:pPr>
       <w:r>
-        <w:t xml:space="preserve">Marano et al. (2016) cung cấp meta-analytic evidence cho thấy home country institutions điều tiết mối quan hệ internationalization–performance, trong khi Cuervo-Cazurra et al. (2018) chỉ ra rằng home country uncertainty tạo ra năng lực quản lý bất định ở doanh nghiệp emerging market. Trong luận án, Institutional Theory cung cấp nền lý thuyết cho giả thuyết về vai trò điều tiết của institutional obstacles và cơ chế "digital shield effect".</w:t>
+        <w:t xml:space="preserve">Marano et al. (2016) cung cấp meta-analytic evidence cho thấy home country institutions điều tiết mối quan hệ internationalization–performance, trong khi Cuervo-Cazurra et al. (2018) chỉ ra rằng home country uncertainty tạo ra năng lực quản lý bất định ở doanh nghiệp emerging market. Trong luận án, Institutional Theory cung cấp nền lý thuyết cho giả thuyết về vai trò điều tiết của institutional obstacles và cơ chế "digital shield effect". Để vận hành hóa tầng thể chế đa cấp, luận án áp dụng khung</w:t>
+      </w:r>
+      <w:r>
+        <w:t xml:space="preserve"> </w:t>
+      </w:r>
+      <w:r>
+        <w:rPr>
+          <w:bCs/>
+          <w:b/>
+        </w:rPr>
+        <w:t xml:space="preserve">ICRV (Institutional Context Regime Variation — Biến thiên chế độ bối cảnh thể chế)</w:t>
+      </w:r>
+      <w:r>
+        <w:t xml:space="preserve"> </w:t>
+      </w:r>
+      <w:r>
+        <w:t xml:space="preserve">phân loại 47 nền kinh tế thành 6 sub-regime: Advanced Innovation-Driven (Singapore), Advanced Resource-Driven (GCC), Upper-middle, Emerging, Frontier, và Pacific SIDS — mở rộng từ phân loại thể chế của Khanna và Palepu (2010) và WGI (Kaufmann et al., 2011).</w:t>
       </w:r>
     </w:p>
     <w:bookmarkEnd w:id="23"/>
@@ -294,7 +310,7 @@
         <w:rPr>
           <w:rStyle w:val="VerbatimChar"/>
         </w:rPr>
-        <w:t xml:space="preserve">          (institutional voids,                 CHARACTERISTICS</w:t>
+        <w:t xml:space="preserve">          (ICRV 6 sub-regime:                  CHARACTERISTICS</w:t>
       </w:r>
       <w:r>
         <w:br/>
@@ -303,7 +319,7 @@
         <w:rPr>
           <w:rStyle w:val="VerbatimChar"/>
         </w:rPr>
-        <w:t xml:space="preserve">           obstacles, regime)                  (experience, gender)</w:t>
+        <w:t xml:space="preserve">           voids, obstacles,                   (experience, gender)</w:t>
       </w:r>
       <w:r>
         <w:br/>
@@ -312,6 +328,15 @@
         <w:rPr>
           <w:rStyle w:val="VerbatimChar"/>
         </w:rPr>
+        <w:t xml:space="preserve">           regime gradient)</w:t>
+      </w:r>
+      <w:r>
+        <w:br/>
+      </w:r>
+      <w:r>
+        <w:rPr>
+          <w:rStyle w:val="VerbatimChar"/>
+        </w:rPr>
         <w:t xml:space="preserve">                  ↓                                  ↓</w:t>
       </w:r>
       <w:r>
@@ -423,7 +448,7 @@
       </w:r>
     </w:p>
     <w:bookmarkEnd w:id="27"/>
-    <w:bookmarkStart w:id="34" w:name="X67d7c27335c27f2fadc02a2ebb6c1da9dfce107"/>
+    <w:bookmarkStart w:id="35" w:name="X67d7c27335c27f2fadc02a2ebb6c1da9dfce107"/>
     <w:p>
       <w:pPr>
         <w:pStyle w:val="Heading2"/>
@@ -465,13 +490,13 @@
       </w:r>
     </w:p>
     <w:bookmarkEnd w:id="28"/>
-    <w:bookmarkStart w:id="29" w:name="X9a26b89d14517b085006256a13520209d33a229"/>
+    <w:bookmarkStart w:id="29" w:name="Xd7ca5812cefb50ae7aa05484c9489f69dc92d00"/>
     <w:p>
       <w:pPr>
         <w:pStyle w:val="Heading3"/>
       </w:pPr>
       <w:r>
-        <w:t xml:space="preserve">H2: Điều tiết bởi technological capability</w:t>
+        <w:t xml:space="preserve">H1b: Điều kiện biên — Gánh nặng quốc tế hóa bắt buộc (FIP) tại Pacific SIDS</w:t>
       </w:r>
     </w:p>
     <w:p>
@@ -483,43 +508,26 @@
           <w:bCs/>
           <w:b/>
         </w:rPr>
-        <w:t xml:space="preserve">H2</w:t>
-      </w:r>
-      <w:r>
-        <w:t xml:space="preserve">: Technological capability làm gia tăng tác động tích cực của quốc tế hóa lên hiệu quả hoạt động của doanh nghiệp, bằng cách nâng mặt bằng performance và làm giảm chi phí học hỏi thị trường quốc tế.</w:t>
-      </w:r>
-    </w:p>
-    <w:p>
-      <w:pPr>
-        <w:pStyle w:val="BodyText"/>
-      </w:pPr>
-      <w:r>
-        <w:t xml:space="preserve">Cơ sở lý thuyết: Barney (1991) với VRIN resources; Teece et al. (1997) với dynamic capabilities; Bhandari et al. (2023) với resource-orchestration trong digital era.</w:t>
-      </w:r>
-    </w:p>
-    <w:bookmarkEnd w:id="29"/>
-    <w:bookmarkStart w:id="30" w:name="h3-điều-tiết-bởi-digital-adoption"/>
-    <w:p>
-      <w:pPr>
-        <w:pStyle w:val="Heading3"/>
-      </w:pPr>
-      <w:r>
-        <w:t xml:space="preserve">H3: Điều tiết bởi digital adoption</w:t>
-      </w:r>
-    </w:p>
-    <w:p>
-      <w:pPr>
-        <w:pStyle w:val="FirstParagraph"/>
-      </w:pPr>
+        <w:t xml:space="preserve">H1b</w:t>
+      </w:r>
+      <w:r>
+        <w:t xml:space="preserve">: Tại các nền kinh tế Pacific SIDS (ICRV Nhóm VI), quan hệ giữa mức độ quốc tế hóa và hiệu quả hoạt động doanh nghiệp là</w:t>
+      </w:r>
+      <w:r>
+        <w:t xml:space="preserve"> </w:t>
+      </w:r>
       <w:r>
         <w:rPr>
           <w:bCs/>
           <w:b/>
         </w:rPr>
-        <w:t xml:space="preserve">H3</w:t>
-      </w:r>
-      <w:r>
-        <w:t xml:space="preserve">: Digital adoption điều tiết mối quan hệ internationalization–firm performance, với vai trò bổ trợ rõ rệt hơn ở mức export intensity cao do giảm coordination cost xuyên biên giới.</w:t>
+        <w:t xml:space="preserve">âm đơn điệu</w:t>
+      </w:r>
+      <w:r>
+        <w:t xml:space="preserve"> </w:t>
+      </w:r>
+      <w:r>
+        <w:t xml:space="preserve">(không có turning point trong phạm vi dữ liệu), phản ánh gánh nặng quốc tế hóa bắt buộc (FIP) nơi ba điều kiện cấu trúc đồng thời bị vi phạm: thị trường nội địa quá nhỏ, chi phí thương mại cực cao, và thiếu hỗ trợ thể chế.</w:t>
       </w:r>
     </w:p>
     <w:p>
@@ -527,50 +535,33 @@
         <w:pStyle w:val="BodyText"/>
       </w:pPr>
       <w:r>
-        <w:t xml:space="preserve">Cơ sở lý thuyết: Verhoef et al. (2021) với digital transformation framework; Stallkamp và Schotter (2021) với platform internationalization; Bustamante et al. (2022) với vai trò của digital capabilities trong SME internationalization. Phân biệt với H2: technological capability chủ yếu tác động như một level shifter, còn digital adoption thay đổi độ dốc hoặc độ cong của đường quan hệ.</w:t>
-      </w:r>
-    </w:p>
-    <w:bookmarkEnd w:id="30"/>
-    <w:bookmarkStart w:id="31" w:name="Xe9e8378d7103b98ea539edbca8a30083a370353"/>
-    <w:p>
-      <w:pPr>
-        <w:pStyle w:val="Heading3"/>
-      </w:pPr>
-      <w:r>
-        <w:t xml:space="preserve">H4: Điều tiết bởi top manager characteristics</w:t>
-      </w:r>
-    </w:p>
-    <w:p>
-      <w:pPr>
-        <w:pStyle w:val="FirstParagraph"/>
-      </w:pPr>
+        <w:t xml:space="preserve">Cơ sở lý thuyết: North (1990) với Institutional Theory; Williamson (1985) với transaction cost theory; Khanna và Palepu (2010) với institutional voids; Lall (2004) với SIDS structural constraints. H1b là</w:t>
+      </w:r>
+      <w:r>
+        <w:t xml:space="preserve"> </w:t>
+      </w:r>
       <w:r>
         <w:rPr>
           <w:bCs/>
           <w:b/>
         </w:rPr>
-        <w:t xml:space="preserve">H4</w:t>
-      </w:r>
-      <w:r>
-        <w:t xml:space="preserve">: Kinh nghiệm và giới tính nữ của nhà quản trị cấp cao làm mạnh hơn tác động tích cực của quốc tế hóa lên hiệu quả hoạt động, qua cơ chế nhận thức chiến lược và quản trị bất định tốt hơn.</w:t>
-      </w:r>
-    </w:p>
-    <w:p>
-      <w:pPr>
-        <w:pStyle w:val="BodyText"/>
-      </w:pPr>
-      <w:r>
-        <w:t xml:space="preserve">Cơ sở lý thuyết: Hambrick và Mason (1984) với Upper Echelons; Hsu et al. (2013) với CEO attributes trong SME internationalization; Post và Byron (2015) với female board representation và firm performance.</w:t>
-      </w:r>
-    </w:p>
-    <w:bookmarkEnd w:id="31"/>
-    <w:bookmarkStart w:id="32" w:name="h5-điều-tiết-bởi-institutional-context"/>
+        <w:t xml:space="preserve">boundary condition</w:t>
+      </w:r>
+      <w:r>
+        <w:t xml:space="preserve"> </w:t>
+      </w:r>
+      <w:r>
+        <w:t xml:space="preserve">của H1: H1 áp dụng khi các điều kiện cấu trúc tối thiểu được đáp ứng; H1b áp dụng khi các điều kiện đó đồng thời thất bại.</w:t>
+      </w:r>
+    </w:p>
+    <w:bookmarkEnd w:id="29"/>
+    <w:bookmarkStart w:id="30" w:name="X9a26b89d14517b085006256a13520209d33a229"/>
     <w:p>
       <w:pPr>
         <w:pStyle w:val="Heading3"/>
       </w:pPr>
       <w:r>
-        <w:t xml:space="preserve">H5: Điều tiết bởi institutional context</w:t>
+        <w:t xml:space="preserve">H2: Điều tiết bởi technological capability</w:t>
       </w:r>
     </w:p>
     <w:p>
@@ -582,10 +573,10 @@
           <w:bCs/>
           <w:b/>
         </w:rPr>
-        <w:t xml:space="preserve">H5</w:t>
-      </w:r>
-      <w:r>
-        <w:t xml:space="preserve">: Chất lượng thể chế làm giảm tác động bất lợi của institutional obstacles lên hiệu quả hoạt động trong quá trình quốc tế hóa, và technology adoption đóng vai trò "digital shield" bù đắp một phần institutional voids.</w:t>
+        <w:t xml:space="preserve">H2</w:t>
+      </w:r>
+      <w:r>
+        <w:t xml:space="preserve">: Technological capability làm gia tăng tác động tích cực của quốc tế hóa lên hiệu quả hoạt động của doanh nghiệp, bằng cách nâng mặt bằng performance và làm giảm chi phí học hỏi thị trường quốc tế.</w:t>
       </w:r>
     </w:p>
     <w:p>
@@ -593,17 +584,17 @@
         <w:pStyle w:val="BodyText"/>
       </w:pPr>
       <w:r>
-        <w:t xml:space="preserve">Cơ sở lý thuyết: North (1990) với institutions và economic performance; Khanna và Palepu (2010) với institutional voids; Marano et al. (2016) với meta-analytic evidence về home country institutions trong I–P relationship.</w:t>
-      </w:r>
-    </w:p>
-    <w:bookmarkEnd w:id="32"/>
-    <w:bookmarkStart w:id="33" w:name="h6-temporal-heterogeneity"/>
+        <w:t xml:space="preserve">Cơ sở lý thuyết: Barney (1991) với VRIN resources; Teece et al. (1997) với dynamic capabilities; Bhandari et al. (2023) với resource-orchestration trong digital era.</w:t>
+      </w:r>
+    </w:p>
+    <w:bookmarkEnd w:id="30"/>
+    <w:bookmarkStart w:id="31" w:name="h3-điều-tiết-bởi-digital-adoption"/>
     <w:p>
       <w:pPr>
         <w:pStyle w:val="Heading3"/>
       </w:pPr>
       <w:r>
-        <w:t xml:space="preserve">H6: Temporal heterogeneity</w:t>
+        <w:t xml:space="preserve">H3: Điều tiết bởi digital adoption</w:t>
       </w:r>
     </w:p>
     <w:p>
@@ -615,6 +606,105 @@
           <w:bCs/>
           <w:b/>
         </w:rPr>
+        <w:t xml:space="preserve">H3</w:t>
+      </w:r>
+      <w:r>
+        <w:t xml:space="preserve">: Digital adoption điều tiết mối quan hệ internationalization–firm performance, với vai trò bổ trợ rõ rệt hơn ở mức export intensity cao do giảm coordination cost xuyên biên giới.</w:t>
+      </w:r>
+    </w:p>
+    <w:p>
+      <w:pPr>
+        <w:pStyle w:val="BodyText"/>
+      </w:pPr>
+      <w:r>
+        <w:t xml:space="preserve">Cơ sở lý thuyết: Verhoef et al. (2021) với digital transformation framework; Stallkamp và Schotter (2021) với platform internationalization; Bustamante et al. (2022) với vai trò của digital capabilities trong SME internationalization. Phân biệt với H2: technological capability chủ yếu tác động như một level shifter, còn digital adoption thay đổi độ dốc hoặc độ cong của đường quan hệ.</w:t>
+      </w:r>
+    </w:p>
+    <w:bookmarkEnd w:id="31"/>
+    <w:bookmarkStart w:id="32" w:name="Xe9e8378d7103b98ea539edbca8a30083a370353"/>
+    <w:p>
+      <w:pPr>
+        <w:pStyle w:val="Heading3"/>
+      </w:pPr>
+      <w:r>
+        <w:t xml:space="preserve">H4: Điều tiết bởi top manager characteristics</w:t>
+      </w:r>
+    </w:p>
+    <w:p>
+      <w:pPr>
+        <w:pStyle w:val="FirstParagraph"/>
+      </w:pPr>
+      <w:r>
+        <w:rPr>
+          <w:bCs/>
+          <w:b/>
+        </w:rPr>
+        <w:t xml:space="preserve">H4</w:t>
+      </w:r>
+      <w:r>
+        <w:t xml:space="preserve">: Kinh nghiệm và giới tính nữ của nhà quản trị cấp cao làm mạnh hơn tác động tích cực của quốc tế hóa lên hiệu quả hoạt động, qua cơ chế nhận thức chiến lược và quản trị bất định tốt hơn.</w:t>
+      </w:r>
+    </w:p>
+    <w:p>
+      <w:pPr>
+        <w:pStyle w:val="BodyText"/>
+      </w:pPr>
+      <w:r>
+        <w:t xml:space="preserve">Cơ sở lý thuyết: Hambrick và Mason (1984) với Upper Echelons; Hsu et al. (2013) với CEO attributes trong SME internationalization; Post và Byron (2015) với female board representation và firm performance.</w:t>
+      </w:r>
+    </w:p>
+    <w:bookmarkEnd w:id="32"/>
+    <w:bookmarkStart w:id="33" w:name="h5-điều-tiết-bởi-institutional-context"/>
+    <w:p>
+      <w:pPr>
+        <w:pStyle w:val="Heading3"/>
+      </w:pPr>
+      <w:r>
+        <w:t xml:space="preserve">H5: Điều tiết bởi institutional context</w:t>
+      </w:r>
+    </w:p>
+    <w:p>
+      <w:pPr>
+        <w:pStyle w:val="FirstParagraph"/>
+      </w:pPr>
+      <w:r>
+        <w:rPr>
+          <w:bCs/>
+          <w:b/>
+        </w:rPr>
+        <w:t xml:space="preserve">H5</w:t>
+      </w:r>
+      <w:r>
+        <w:t xml:space="preserve">: Chất lượng thể chế theo khung ICRV (6 sub-regime từ Advanced Innovation-Driven đến Pacific SIDS) điều tiết tác động của institutional obstacles lên hiệu quả hoạt động trong quá trình quốc tế hóa, với digital adoption đóng vai trò "digital shield" bù đắp một phần institutional voids — với cường độ điều tiết giảm dần theo gradient ICRV từ Frontier đến Advanced.</w:t>
+      </w:r>
+    </w:p>
+    <w:p>
+      <w:pPr>
+        <w:pStyle w:val="BodyText"/>
+      </w:pPr>
+      <w:r>
+        <w:t xml:space="preserve">Cơ sở lý thuyết: North (1990) với institutions và economic performance; Khanna và Palepu (2010) với institutional voids; Marano et al. (2016) với meta-analytic evidence về home country institutions trong I–P relationship.</w:t>
+      </w:r>
+    </w:p>
+    <w:bookmarkEnd w:id="33"/>
+    <w:bookmarkStart w:id="34" w:name="h6-temporal-heterogeneity"/>
+    <w:p>
+      <w:pPr>
+        <w:pStyle w:val="Heading3"/>
+      </w:pPr>
+      <w:r>
+        <w:t xml:space="preserve">H6: Temporal heterogeneity</w:t>
+      </w:r>
+    </w:p>
+    <w:p>
+      <w:pPr>
+        <w:pStyle w:val="FirstParagraph"/>
+      </w:pPr>
+      <w:r>
+        <w:rPr>
+          <w:bCs/>
+          <w:b/>
+        </w:rPr>
         <w:t xml:space="preserve">H6</w:t>
       </w:r>
       <w:r>
@@ -629,9 +719,9 @@
         <w:t xml:space="preserve">Cơ sở lý thuyết: Wu et al. (2022) với twenty-year meta-analysis về EMNEs; Xiao et al. (2013) về China-specific governance moderators; Banalieva và Dhanaraj (2019) về evolving internalization logic trong digital era.</w:t>
       </w:r>
     </w:p>
-    <w:bookmarkEnd w:id="33"/>
     <w:bookmarkEnd w:id="34"/>
-    <w:bookmarkStart w:id="35" w:name="X0a2444725eaba92459713c41026a3b735044e7f"/>
+    <w:bookmarkEnd w:id="35"/>
+    <w:bookmarkStart w:id="36" w:name="X0a2444725eaba92459713c41026a3b735044e7f"/>
     <w:p>
       <w:pPr>
         <w:pStyle w:val="Heading2"/>
@@ -792,6 +882,44 @@
               <w:jc w:val="left"/>
             </w:pPr>
             <w:r>
+              <w:t xml:space="preserve">H1b</w:t>
+            </w:r>
+          </w:p>
+        </w:tc>
+        <w:tc>
+          <w:tcPr/>
+          <w:p>
+            <w:pPr>
+              <w:pStyle w:val="Compact"/>
+              <w:jc w:val="left"/>
+            </w:pPr>
+            <w:r>
+              <w:t xml:space="preserve">Mô hình M1 tuyến tính tại SIDS; Lind–Mehlum U-test (NS); exporters-only robustness</w:t>
+            </w:r>
+          </w:p>
+        </w:tc>
+        <w:tc>
+          <w:tcPr/>
+          <w:p>
+            <w:pPr>
+              <w:pStyle w:val="Compact"/>
+              <w:jc w:val="left"/>
+            </w:pPr>
+            <w:r>
+              <w:t xml:space="preserve">Pacific SIDS (P8)</w:t>
+            </w:r>
+          </w:p>
+        </w:tc>
+      </w:tr>
+      <w:tr>
+        <w:tc>
+          <w:tcPr/>
+          <w:p>
+            <w:pPr>
+              <w:pStyle w:val="Compact"/>
+              <w:jc w:val="left"/>
+            </w:pPr>
+            <w:r>
               <w:t xml:space="preserve">H2</w:t>
             </w:r>
           </w:p>
@@ -1266,7 +1394,7 @@
               </m:sSub>
             </m:oMath>
             <w:r>
-              <w:t xml:space="preserve">; subgroup theo regime</w:t>
+              <w:t xml:space="preserve">; subgroup theo ICRV regime (Advanced / Emerging / Frontier / SIDS)</w:t>
             </w:r>
           </w:p>
         </w:tc>
@@ -1445,8 +1573,8 @@
         <w:t xml:space="preserve">.</w:t>
       </w:r>
     </w:p>
-    <w:bookmarkEnd w:id="35"/>
-    <w:bookmarkStart w:id="36" w:name="X2810c7ffc44c901c9ca5c26e4d959f62e9ae9a2"/>
+    <w:bookmarkEnd w:id="36"/>
+    <w:bookmarkStart w:id="37" w:name="X2810c7ffc44c901c9ca5c26e4d959f62e9ae9a2"/>
     <w:p>
       <w:pPr>
         <w:pStyle w:val="Heading2"/>
@@ -1471,8 +1599,8 @@
         <w:t xml:space="preserve">Luận án đóng góp vào cả ba dý ng bằng việc tích hợp chúng vào một khung nhất quán và kiểm định trên dữ liệu doanh nghiệp quy mô lớn tại châu Á, một bối cảnh underrepresented trong các meta-analyses quốc tế trước đây.</w:t>
       </w:r>
     </w:p>
-    <w:bookmarkEnd w:id="36"/>
     <w:bookmarkEnd w:id="37"/>
+    <w:bookmarkEnd w:id="38"/>
     <w:sectPr>
       <w:pgSz w:h="16838" w:w="11906"/>
       <w:pgMar w:bottom="1134" w:left="1701" w:right="1134" w:top="1134"/>

</xml_diff>